<commit_message>
Phase 8 Zero Trust extension; portfolio score updates; slot 7 screenshot; SCAP QuickRef promoted; scanner enhanced
</commit_message>
<xml_diff>
--- a/Portfolio/CAC-Program-Showcase-GlennByron.docx
+++ b/Portfolio/CAC-Program-Showcase-GlennByron.docx
@@ -6363,6 +6363,354 @@
       </w:pPr>
       <w:r>
         <w:t xml:space="preserve">This document is an original work by Glenn Byron. All technical content reflects personally engineered architecture, automation, and documentation. No organizational production data is included. All identifiers use generic placeholders per repository sanitization policy.</w:t>
+      </w:r>
+    </w:p>
+    <w:p>
+      <w:r>
+        <w:br w:type="page"/>
+      </w:r>
+    </w:p>
+    <w:p>
+      <w:r>
+        <w:rPr>
+          <w:b/>
+          <w:color w:val="1F3A55"/>
+          <w:sz w:val="36"/>
+        </w:rPr>
+        <w:t>Lab Results - SCAP Compliance Snapshot</w:t>
+      </w:r>
+    </w:p>
+    <w:p>
+      <w:r>
+        <w:rPr>
+          <w:i w:val="0"/>
+        </w:rPr>
+        <w:t xml:space="preserve">Scans run with </w:t>
+      </w:r>
+      <w:r>
+        <w:rPr>
+          <w:b/>
+        </w:rPr>
+        <w:t>SCAP Compliance Checker (SCC) 5.10.2</w:t>
+      </w:r>
+      <w:r>
+        <w:t xml:space="preserve"> on the lab hosts. The Before / After-MFA delta isolates the IA-2(11) authentication-pillar change. Full benchmark hardening is scoped as the next compliance phase.</w:t>
+      </w:r>
+    </w:p>
+    <w:p/>
+    <w:tbl>
+      <w:tblPr>
+        <w:tblW w:type="auto" w:w="0"/>
+        <w:tblLayout w:type="autofit"/>
+        <w:tblLook w:firstColumn="1" w:firstRow="1" w:lastColumn="0" w:lastRow="0" w:noHBand="0" w:noVBand="1" w:val="04A0"/>
+      </w:tblPr>
+      <w:tblGrid>
+        <w:gridCol w:w="1560"/>
+        <w:gridCol w:w="1560"/>
+        <w:gridCol w:w="1560"/>
+        <w:gridCol w:w="1560"/>
+        <w:gridCol w:w="1560"/>
+        <w:gridCol w:w="1560"/>
+      </w:tblGrid>
+      <w:tr>
+        <w:tc>
+          <w:tcPr>
+            <w:tcW w:type="dxa" w:w="1560"/>
+          </w:tcPr>
+          <w:p>
+            <w:r>
+              <w:rPr>
+                <w:b/>
+              </w:rPr>
+              <w:t>Host</w:t>
+            </w:r>
+          </w:p>
+        </w:tc>
+        <w:tc>
+          <w:tcPr>
+            <w:tcW w:type="dxa" w:w="1560"/>
+          </w:tcPr>
+          <w:p>
+            <w:r>
+              <w:rPr>
+                <w:b/>
+              </w:rPr>
+              <w:t>Benchmark</w:t>
+            </w:r>
+          </w:p>
+        </w:tc>
+        <w:tc>
+          <w:tcPr>
+            <w:tcW w:type="dxa" w:w="1560"/>
+          </w:tcPr>
+          <w:p>
+            <w:r>
+              <w:rPr>
+                <w:b/>
+              </w:rPr>
+              <w:t>Stage</w:t>
+            </w:r>
+          </w:p>
+        </w:tc>
+        <w:tc>
+          <w:tcPr>
+            <w:tcW w:type="dxa" w:w="1560"/>
+          </w:tcPr>
+          <w:p>
+            <w:r>
+              <w:rPr>
+                <w:b/>
+              </w:rPr>
+              <w:t>Score</w:t>
+            </w:r>
+          </w:p>
+        </w:tc>
+        <w:tc>
+          <w:tcPr>
+            <w:tcW w:type="dxa" w:w="1560"/>
+          </w:tcPr>
+          <w:p>
+            <w:r>
+              <w:rPr>
+                <w:b/>
+              </w:rPr>
+              <w:t>CAT I open</w:t>
+            </w:r>
+          </w:p>
+        </w:tc>
+        <w:tc>
+          <w:tcPr>
+            <w:tcW w:type="dxa" w:w="1560"/>
+          </w:tcPr>
+          <w:p>
+            <w:r>
+              <w:rPr>
+                <w:b/>
+              </w:rPr>
+              <w:t>CAT II open</w:t>
+            </w:r>
+          </w:p>
+        </w:tc>
+      </w:tr>
+      <w:tr>
+        <w:tc>
+          <w:tcPr>
+            <w:tcW w:type="dxa" w:w="1560"/>
+          </w:tcPr>
+          <w:p>
+            <w:r>
+              <w:t>Lab-DC01</w:t>
+            </w:r>
+          </w:p>
+        </w:tc>
+        <w:tc>
+          <w:tcPr>
+            <w:tcW w:type="dxa" w:w="1560"/>
+          </w:tcPr>
+          <w:p>
+            <w:r>
+              <w:t>WS 2022 STIG 2.3.10</w:t>
+            </w:r>
+          </w:p>
+        </w:tc>
+        <w:tc>
+          <w:tcPr>
+            <w:tcW w:type="dxa" w:w="1560"/>
+          </w:tcPr>
+          <w:p>
+            <w:r>
+              <w:t>Before -&gt; After-MFA</w:t>
+            </w:r>
+          </w:p>
+        </w:tc>
+        <w:tc>
+          <w:tcPr>
+            <w:tcW w:type="dxa" w:w="1560"/>
+          </w:tcPr>
+          <w:p>
+            <w:r>
+              <w:t>44.95% -&gt; 42.66%</w:t>
+            </w:r>
+          </w:p>
+        </w:tc>
+        <w:tc>
+          <w:tcPr>
+            <w:tcW w:type="dxa" w:w="1560"/>
+          </w:tcPr>
+          <w:p>
+            <w:r>
+              <w:t>9</w:t>
+            </w:r>
+          </w:p>
+        </w:tc>
+        <w:tc>
+          <w:tcPr>
+            <w:tcW w:type="dxa" w:w="1560"/>
+          </w:tcPr>
+          <w:p>
+            <w:r>
+              <w:t>110</w:t>
+            </w:r>
+          </w:p>
+        </w:tc>
+      </w:tr>
+      <w:tr>
+        <w:tc>
+          <w:tcPr>
+            <w:tcW w:type="dxa" w:w="1560"/>
+          </w:tcPr>
+          <w:p>
+            <w:r>
+              <w:t>Lab-Workstation01</w:t>
+            </w:r>
+          </w:p>
+        </w:tc>
+        <w:tc>
+          <w:tcPr>
+            <w:tcW w:type="dxa" w:w="1560"/>
+          </w:tcPr>
+          <w:p>
+            <w:r>
+              <w:t>WS 2022 STIG 2.3.10</w:t>
+            </w:r>
+          </w:p>
+        </w:tc>
+        <w:tc>
+          <w:tcPr>
+            <w:tcW w:type="dxa" w:w="1560"/>
+          </w:tcPr>
+          <w:p>
+            <w:r>
+              <w:t>Before -&gt; After-MFA</w:t>
+            </w:r>
+          </w:p>
+        </w:tc>
+        <w:tc>
+          <w:tcPr>
+            <w:tcW w:type="dxa" w:w="1560"/>
+          </w:tcPr>
+          <w:p>
+            <w:r>
+              <w:t>42.20% -&gt; 42.20%</w:t>
+            </w:r>
+          </w:p>
+        </w:tc>
+        <w:tc>
+          <w:tcPr>
+            <w:tcW w:type="dxa" w:w="1560"/>
+          </w:tcPr>
+          <w:p>
+            <w:r>
+              <w:t>9</w:t>
+            </w:r>
+          </w:p>
+        </w:tc>
+        <w:tc>
+          <w:tcPr>
+            <w:tcW w:type="dxa" w:w="1560"/>
+          </w:tcPr>
+          <w:p>
+            <w:r>
+              <w:t>111</w:t>
+            </w:r>
+          </w:p>
+        </w:tc>
+      </w:tr>
+      <w:tr>
+        <w:tc>
+          <w:tcPr>
+            <w:tcW w:type="dxa" w:w="1560"/>
+          </w:tcPr>
+          <w:p>
+            <w:r>
+              <w:t>WO02 (physical laptop)</w:t>
+            </w:r>
+          </w:p>
+        </w:tc>
+        <w:tc>
+          <w:tcPr>
+            <w:tcW w:type="dxa" w:w="1560"/>
+          </w:tcPr>
+          <w:p>
+            <w:r>
+              <w:t>Win 11 STIG 2.3.9 (MAC-1 Classified)</w:t>
+            </w:r>
+          </w:p>
+        </w:tc>
+        <w:tc>
+          <w:tcPr>
+            <w:tcW w:type="dxa" w:w="1560"/>
+          </w:tcPr>
+          <w:p>
+            <w:r>
+              <w:t>After-SmartCard (baseline)</w:t>
+            </w:r>
+          </w:p>
+        </w:tc>
+        <w:tc>
+          <w:tcPr>
+            <w:tcW w:type="dxa" w:w="1560"/>
+          </w:tcPr>
+          <w:p>
+            <w:r>
+              <w:t>37.00%</w:t>
+            </w:r>
+          </w:p>
+        </w:tc>
+        <w:tc>
+          <w:tcPr>
+            <w:tcW w:type="dxa" w:w="1560"/>
+          </w:tcPr>
+          <w:p>
+            <w:r>
+              <w:t>13</w:t>
+            </w:r>
+          </w:p>
+        </w:tc>
+        <w:tc>
+          <w:tcPr>
+            <w:tcW w:type="dxa" w:w="1560"/>
+          </w:tcPr>
+          <w:p>
+            <w:r>
+              <w:t>122</w:t>
+            </w:r>
+          </w:p>
+        </w:tc>
+      </w:tr>
+    </w:tbl>
+    <w:p/>
+    <w:p>
+      <w:r>
+        <w:rPr>
+          <w:b/>
+        </w:rPr>
+        <w:t xml:space="preserve">Interpretation: </w:t>
+      </w:r>
+      <w:r>
+        <w:t>Scores move only slightly between stages because the smart-card hardening phase targeted the Identity authentication pillar (NIST IA-2, IA-5) - not a full STIG hardening pass. WO02 is lower because it scored against a stricter benchmark (Windows 11 STIG, MAC-1 Classified profile, 258 rules) with only the smart card GPO applied; BitLocker, AppLocker, Defender exclusions, and broader Server-class controls are deferred to the next compliance phase.</w:t>
+      </w:r>
+    </w:p>
+    <w:p>
+      <w:r>
+        <w:rPr>
+          <w:b/>
+        </w:rPr>
+        <w:t xml:space="preserve">What the numbers prove: </w:t>
+      </w:r>
+      <w:r>
+        <w:t>Smart-card enforcement is operational across the entire fleet. Event 4768 with Pre-Auth Type 16 (PKINIT) captured on DC01 confirms certificate-based Kerberos at the protocol level - the headline NIST IA-2(11) evidence regardless of overall STIG score.</w:t>
+      </w:r>
+    </w:p>
+    <w:p>
+      <w:r>
+        <w:rPr>
+          <w:b/>
+        </w:rPr>
+        <w:t xml:space="preserve">Source: </w:t>
+      </w:r>
+      <w:r>
+        <w:t>Compliance-Reports/After-MFA/ (DC01 + WS01, 2026-05-28) and Compliance-Reports/Laptop/After-SmartCard/2026-06-02_104513/ (WO02). Full HTML reports, XCCDF XML, OVAL/OCIL XML, and STIG Viewer CKL checklists are staged for each scan.</w:t>
       </w:r>
     </w:p>
     <w:sectPr>

</xml_diff>

<commit_message>
Remove internal-use/confidential stamps from public portfolio docs
</commit_message>
<xml_diff>
--- a/Portfolio/CAC-Program-Showcase-GlennByron.docx
+++ b/Portfolio/CAC-Program-Showcase-GlennByron.docx
@@ -6716,6 +6716,10 @@
     <w:sectPr>
       <w:headerReference w:type="default" r:id="rId7"/>
       <w:footerReference w:type="default" r:id="rId8"/>
+      <w:headerReference w:type="first" r:id="rId10"/>
+      <w:footerReference w:type="first" r:id="rId11"/>
+      <w:headerReference w:type="even" r:id="rId12"/>
+      <w:footerReference w:type="even" r:id="rId13"/>
       <w:pgSz w:w="12240" w:h="15840" w:orient="portrait"/>
       <w:pgMar w:top="1440" w:right="1440" w:bottom="1440" w:left="1440" w:header="708" w:footer="708" w:gutter="0"/>
       <w:pgNumType/>
@@ -6784,7 +6788,6 @@
         <w:sz w:val="18"/>
         <w:szCs w:val="18"/>
       </w:rPr>
-      <w:t xml:space="preserve">Confidential Portfolio Document — Glenn Byron, 2026</w:t>
     </w:r>
     <w:r>
       <w:rPr>
@@ -6813,6 +6816,26 @@
       <w:fldChar w:fldCharType="separate"/>
       <w:fldChar w:fldCharType="end"/>
     </w:r>
+  </w:p>
+</w:ftr>
+</file>
+
+<file path=word/footer2.xml><?xml version="1.0" encoding="utf-8"?>
+<w:ftr xmlns:m="http://schemas.openxmlformats.org/officeDocument/2006/math" xmlns:mc="http://schemas.openxmlformats.org/markup-compatibility/2006" xmlns:mo="http://schemas.microsoft.com/office/mac/office/2008/main" xmlns:mv="urn:schemas-microsoft-com:mac:vml" xmlns:o="urn:schemas-microsoft-com:office:office" xmlns:r="http://schemas.openxmlformats.org/officeDocument/2006/relationships" xmlns:v="urn:schemas-microsoft-com:vml" xmlns:w10="urn:schemas-microsoft-com:office:word" xmlns:w14="http://schemas.microsoft.com/office/word/2010/wordml" xmlns:w="http://schemas.openxmlformats.org/wordprocessingml/2006/main" xmlns:wne="http://schemas.microsoft.com/office/word/2006/wordml" xmlns:wp14="http://schemas.microsoft.com/office/word/2010/wordprocessingDrawing" xmlns:wp="http://schemas.openxmlformats.org/drawingml/2006/wordprocessingDrawing" xmlns:wpc="http://schemas.microsoft.com/office/word/2010/wordprocessingCanvas" xmlns:wpg="http://schemas.microsoft.com/office/word/2010/wordprocessingGroup" xmlns:wpi="http://schemas.microsoft.com/office/word/2010/wordprocessingInk" xmlns:wps="http://schemas.microsoft.com/office/word/2010/wordprocessingShape" mc:Ignorable="w14 wp14">
+  <w:p>
+    <w:pPr>
+      <w:pStyle w:val="Footer"/>
+    </w:pPr>
+  </w:p>
+</w:ftr>
+</file>
+
+<file path=word/footer3.xml><?xml version="1.0" encoding="utf-8"?>
+<w:ftr xmlns:m="http://schemas.openxmlformats.org/officeDocument/2006/math" xmlns:mc="http://schemas.openxmlformats.org/markup-compatibility/2006" xmlns:mo="http://schemas.microsoft.com/office/mac/office/2008/main" xmlns:mv="urn:schemas-microsoft-com:mac:vml" xmlns:o="urn:schemas-microsoft-com:office:office" xmlns:r="http://schemas.openxmlformats.org/officeDocument/2006/relationships" xmlns:v="urn:schemas-microsoft-com:vml" xmlns:w10="urn:schemas-microsoft-com:office:word" xmlns:w14="http://schemas.microsoft.com/office/word/2010/wordml" xmlns:w="http://schemas.openxmlformats.org/wordprocessingml/2006/main" xmlns:wne="http://schemas.microsoft.com/office/word/2006/wordml" xmlns:wp14="http://schemas.microsoft.com/office/word/2010/wordprocessingDrawing" xmlns:wp="http://schemas.openxmlformats.org/drawingml/2006/wordprocessingDrawing" xmlns:wpc="http://schemas.microsoft.com/office/word/2010/wordprocessingCanvas" xmlns:wpg="http://schemas.microsoft.com/office/word/2010/wordprocessingGroup" xmlns:wpi="http://schemas.microsoft.com/office/word/2010/wordprocessingInk" xmlns:wps="http://schemas.microsoft.com/office/word/2010/wordprocessingShape" mc:Ignorable="w14 wp14">
+  <w:p>
+    <w:pPr>
+      <w:pStyle w:val="Footer"/>
+    </w:pPr>
   </w:p>
 </w:ftr>
 </file>
@@ -6889,6 +6912,26 @@
       </w:rPr>
       <w:t xml:space="preserve">SHOW-ICAM-001</w:t>
     </w:r>
+  </w:p>
+</w:hdr>
+</file>
+
+<file path=word/header2.xml><?xml version="1.0" encoding="utf-8"?>
+<w:hdr xmlns:m="http://schemas.openxmlformats.org/officeDocument/2006/math" xmlns:mc="http://schemas.openxmlformats.org/markup-compatibility/2006" xmlns:mo="http://schemas.microsoft.com/office/mac/office/2008/main" xmlns:mv="urn:schemas-microsoft-com:mac:vml" xmlns:o="urn:schemas-microsoft-com:office:office" xmlns:r="http://schemas.openxmlformats.org/officeDocument/2006/relationships" xmlns:v="urn:schemas-microsoft-com:vml" xmlns:w10="urn:schemas-microsoft-com:office:word" xmlns:w14="http://schemas.microsoft.com/office/word/2010/wordml" xmlns:w="http://schemas.openxmlformats.org/wordprocessingml/2006/main" xmlns:wne="http://schemas.microsoft.com/office/word/2006/wordml" xmlns:wp14="http://schemas.microsoft.com/office/word/2010/wordprocessingDrawing" xmlns:wp="http://schemas.openxmlformats.org/drawingml/2006/wordprocessingDrawing" xmlns:wpc="http://schemas.microsoft.com/office/word/2010/wordprocessingCanvas" xmlns:wpg="http://schemas.microsoft.com/office/word/2010/wordprocessingGroup" xmlns:wpi="http://schemas.microsoft.com/office/word/2010/wordprocessingInk" xmlns:wps="http://schemas.microsoft.com/office/word/2010/wordprocessingShape" mc:Ignorable="w14 wp14">
+  <w:p>
+    <w:pPr>
+      <w:pStyle w:val="Header"/>
+    </w:pPr>
+  </w:p>
+</w:hdr>
+</file>
+
+<file path=word/header3.xml><?xml version="1.0" encoding="utf-8"?>
+<w:hdr xmlns:m="http://schemas.openxmlformats.org/officeDocument/2006/math" xmlns:mc="http://schemas.openxmlformats.org/markup-compatibility/2006" xmlns:mo="http://schemas.microsoft.com/office/mac/office/2008/main" xmlns:mv="urn:schemas-microsoft-com:mac:vml" xmlns:o="urn:schemas-microsoft-com:office:office" xmlns:r="http://schemas.openxmlformats.org/officeDocument/2006/relationships" xmlns:v="urn:schemas-microsoft-com:vml" xmlns:w10="urn:schemas-microsoft-com:office:word" xmlns:w14="http://schemas.microsoft.com/office/word/2010/wordml" xmlns:w="http://schemas.openxmlformats.org/wordprocessingml/2006/main" xmlns:wne="http://schemas.microsoft.com/office/word/2006/wordml" xmlns:wp14="http://schemas.microsoft.com/office/word/2010/wordprocessingDrawing" xmlns:wp="http://schemas.openxmlformats.org/drawingml/2006/wordprocessingDrawing" xmlns:wpc="http://schemas.microsoft.com/office/word/2010/wordprocessingCanvas" xmlns:wpg="http://schemas.microsoft.com/office/word/2010/wordprocessingGroup" xmlns:wpi="http://schemas.microsoft.com/office/word/2010/wordprocessingInk" xmlns:wps="http://schemas.microsoft.com/office/word/2010/wordprocessingShape" mc:Ignorable="w14 wp14">
+  <w:p>
+    <w:pPr>
+      <w:pStyle w:val="Header"/>
+    </w:pPr>
   </w:p>
 </w:hdr>
 </file>

</xml_diff>

<commit_message>
Portfolio: add Hirsch federal-evidence section + TODO: v1.2 cleanup pass
</commit_message>
<xml_diff>
--- a/Portfolio/CAC-Program-Showcase-GlennByron.docx
+++ b/Portfolio/CAC-Program-Showcase-GlennByron.docx
@@ -601,7 +601,7 @@
           </w:tcPr>
           <w:p>
             <w:r>
-              <w:t xml:space="preserve">CardLogix GIDS Smart Cards / YubiKey 5 Series</w:t>
+              <w:t>GIDS Smart Cards / YubiKey 5 Series</w:t>
             </w:r>
           </w:p>
         </w:tc>
@@ -4799,7 +4799,7 @@
           </w:tcPr>
           <w:p>
             <w:r>
-              <w:t xml:space="preserve">Cost-effective commercial COTS tokens: CardLogix GIDS smart cards, HIRSCH uTrust FIDO2 NFC+ keys</w:t>
+              <w:t>Cost-effective commercial COTS tokens: GIDS smart cards, HIRSCH uTrust FIDO2 NFC+ keys</w:t>
             </w:r>
           </w:p>
         </w:tc>
@@ -5402,7 +5402,7 @@
           </w:tcPr>
           <w:p>
             <w:r>
-              <w:t xml:space="preserve">Card profile matrix (CardLogix GIDS standard / YubiKey 5 privileged); dual-slot admin separation; derived credential issuance lifecycle; CHUID / PACS integration</w:t>
+              <w:t>Card profile matrix (GIDS standard / YubiKey 5 privileged); dual-slot admin separation; derived credential issuance lifecycle; CHUID / PACS integration</w:t>
             </w:r>
           </w:p>
         </w:tc>

</xml_diff>

<commit_message>
v1.4 — Ansible STIG 44.95→86.7% on LAB-DC01 + Phase 8 ZT 21 scripts + cert tool + code-review fixes + deep-dive cleanup + portfolio refresh
</commit_message>
<xml_diff>
--- a/Portfolio/CAC-Program-Showcase-GlennByron.docx
+++ b/Portfolio/CAC-Program-Showcase-GlennByron.docx
@@ -29,6 +29,64 @@
         <w:t xml:space="preserve">PORTFOLIO SHOWCASE</w:t>
       </w:r>
     </w:p>
+    <w:p/>
+    <w:p>
+      <w:pPr>
+        <w:shd w:val="clear" w:color="auto" w:fill="EAF2FA"/>
+        <w:pBdr>
+          <w:top w:val="single" w:sz="6" w:space="4" w:color="2E75B6"/>
+          <w:left w:val="single" w:sz="6" w:space="4" w:color="2E75B6"/>
+          <w:right w:val="single" w:sz="6" w:space="4" w:color="2E75B6"/>
+        </w:pBdr>
+      </w:pPr>
+      <w:r>
+        <w:rPr>
+          <w:rFonts w:ascii="Arial" w:hAnsi="Arial"/>
+          <w:b/>
+          <w:i w:val="0"/>
+          <w:sz w:val="22"/>
+        </w:rPr>
+        <w:t>Latest milestone — June 30, 2026 (v1.4 ship): Ansible STIG remediation applied.</w:t>
+      </w:r>
+    </w:p>
+    <w:p>
+      <w:pPr>
+        <w:shd w:val="clear" w:color="auto" w:fill="EAF2FA"/>
+        <w:pBdr>
+          <w:left w:val="single" w:sz="6" w:space="4" w:color="2E75B6"/>
+          <w:right w:val="single" w:sz="6" w:space="4" w:color="2E75B6"/>
+        </w:pBdr>
+      </w:pPr>
+      <w:r>
+        <w:rPr>
+          <w:rFonts w:ascii="Arial" w:hAnsi="Arial"/>
+          <w:b w:val="0"/>
+          <w:i w:val="0"/>
+          <w:sz w:val="22"/>
+        </w:rPr>
+        <w:t>LAB-DC01 SCAP compliance climbed from a 44.95% baseline to 86.7% via the community ansible-lockdown Windows-2022-STIG role driven from a WSL2 control node. Three severity-tagged phases applied (CAT I → II → III) with VM snapshot and connectivity verification between each. Eight CAT I findings closed and verified by post-Ansible SCAP scan (Compliance-Reports/After-Ansible/). The remaining gap is honest: items deliberately left off via the role’s disruption_high / complexity_high safety guards, four Server-2025 vs. 2022-benchmark mismatches disabled in group_vars, and manual AUDIT controls that require human review. New module shipped at Lab-Kit/08-Ansible-STIG/.</w:t>
+      </w:r>
+    </w:p>
+    <w:p>
+      <w:pPr>
+        <w:shd w:val="clear" w:color="auto" w:fill="EAF2FA"/>
+        <w:pBdr>
+          <w:bottom w:val="single" w:sz="6" w:space="4" w:color="2E75B6"/>
+          <w:left w:val="single" w:sz="6" w:space="4" w:color="2E75B6"/>
+          <w:right w:val="single" w:sz="6" w:space="4" w:color="2E75B6"/>
+        </w:pBdr>
+      </w:pPr>
+      <w:r>
+        <w:rPr>
+          <w:rFonts w:ascii="Arial" w:hAnsi="Arial"/>
+          <w:b w:val="0"/>
+          <w:i w:val="0"/>
+          <w:sz w:val="22"/>
+        </w:rPr>
+        <w:t>Companion v1.4 deliverables: defensive cert-audit tool (security/scripts/Check-SelfSignedCerts.ps1) with offline-CA thumbprint protection, and Phase 8 Zero Trust extension promoted from 8 full + 13 scaffolds to 21 full scripts.</w:t>
+      </w:r>
+    </w:p>
+    <w:p/>
     <w:p>
       <w:pPr>
         <w:spacing w:after="0"/>
@@ -6674,6 +6732,86 @@
           <w:p>
             <w:r>
               <w:t>122</w:t>
+            </w:r>
+          </w:p>
+        </w:tc>
+      </w:tr>
+      <w:tr>
+        <w:tc>
+          <w:tcPr>
+            <w:tcW w:type="dxa" w:w="1560"/>
+          </w:tcPr>
+          <w:p>
+            <w:r>
+              <w:rPr>
+                <w:b/>
+              </w:rPr>
+              <w:t>Lab-DC01</w:t>
+            </w:r>
+          </w:p>
+        </w:tc>
+        <w:tc>
+          <w:tcPr>
+            <w:tcW w:type="dxa" w:w="1560"/>
+          </w:tcPr>
+          <w:p>
+            <w:r>
+              <w:rPr>
+                <w:b/>
+              </w:rPr>
+              <w:t>WS 2022 STIG 2.3.10</w:t>
+            </w:r>
+          </w:p>
+        </w:tc>
+        <w:tc>
+          <w:tcPr>
+            <w:tcW w:type="dxa" w:w="1560"/>
+          </w:tcPr>
+          <w:p>
+            <w:r>
+              <w:rPr>
+                <w:b/>
+              </w:rPr>
+              <w:t>After-Ansible (v1.4, 2026-06-30)</w:t>
+            </w:r>
+          </w:p>
+        </w:tc>
+        <w:tc>
+          <w:tcPr>
+            <w:tcW w:type="dxa" w:w="1560"/>
+          </w:tcPr>
+          <w:p>
+            <w:r>
+              <w:rPr>
+                <w:b/>
+              </w:rPr>
+              <w:t>42.66% → 86.70%</w:t>
+            </w:r>
+          </w:p>
+        </w:tc>
+        <w:tc>
+          <w:tcPr>
+            <w:tcW w:type="dxa" w:w="1560"/>
+          </w:tcPr>
+          <w:p>
+            <w:r>
+              <w:rPr>
+                <w:b/>
+              </w:rPr>
+              <w:t>1</w:t>
+            </w:r>
+          </w:p>
+        </w:tc>
+        <w:tc>
+          <w:tcPr>
+            <w:tcW w:type="dxa" w:w="1560"/>
+          </w:tcPr>
+          <w:p>
+            <w:r>
+              <w:rPr>
+                <w:b/>
+              </w:rPr>
+              <w:t>27</w:t>
             </w:r>
           </w:p>
         </w:tc>

</xml_diff>